<commit_message>
docs: rewrite report headings as declarative statements
Co-authored-by: Tao Gao <taogao1991@outlook.com>
</commit_message>
<xml_diff>
--- a/docs/supernode-scale/昇腾超节点规模需求分析.docx
+++ b/docs/supernode-scale/昇腾超节点规模需求分析.docx
@@ -124,7 +124,7 @@
         <w:pStyle w:val="FirstParagraph"/>
       </w:pPr>
       <w:r>
-        <w:t xml:space="preserve">超节点规模不是“卡越多越好”，也不能只用“模型能不能装下”判断。真正决定规模的是三件事：</w:t>
+        <w:t xml:space="preserve">超节点规模不是“卡越多越好”，也不能只用模型装入容量判断。真正决定规模的是三件事：</w:t>
       </w:r>
     </w:p>
     <w:p>
@@ -143,7 +143,7 @@
         <w:t xml:space="preserve">容量下界</w:t>
       </w:r>
       <w:r>
-        <w:t xml:space="preserve">：权重、训练状态、Activation 或 KV Cache 至少需要多少 HBM；</w:t>
+        <w:t xml:space="preserve">：权重、训练状态、Activation 或 KV Cache 所需的最小 HBM 容量；</w:t>
       </w:r>
     </w:p>
     <w:p>
@@ -162,7 +162,7 @@
         <w:t xml:space="preserve">性能下界</w:t>
       </w:r>
       <w:r>
-        <w:t xml:space="preserve">：目标训练速度、推理吞吐或时延至少需要多少算力与带宽；</w:t>
+        <w:t xml:space="preserve">：目标训练速度、推理吞吐或时延所需的最小算力与带宽；</w:t>
       </w:r>
     </w:p>
     <w:p>
@@ -181,7 +181,7 @@
         <w:t xml:space="preserve">通信边界</w:t>
       </w:r>
       <w:r>
-        <w:t xml:space="preserve">：张量并行、专家并行和上下文并行产生的高频通信，是否应限制在同一个高速互联域内。</w:t>
+        <w:t xml:space="preserve">：张量并行、专家并行和上下文并行产生的高频通信所要求的高速互联域范围。</w:t>
       </w:r>
     </w:p>
     <w:p>
@@ -815,13 +815,13 @@
     </w:p>
     <w:bookmarkEnd w:id="20"/>
     <w:bookmarkEnd w:id="21"/>
-    <w:bookmarkStart w:id="25" w:name="超节点规模问题是什么"/>
+    <w:bookmarkStart w:id="25" w:name="超节点规模的定义与边界"/>
     <w:p>
       <w:pPr>
         <w:pStyle w:val="Heading2"/>
       </w:pPr>
       <w:r>
-        <w:t xml:space="preserve">1. 超节点规模问题是什么</w:t>
+        <w:t xml:space="preserve">1. 超节点规模的定义与边界</w:t>
       </w:r>
     </w:p>
     <w:bookmarkStart w:id="22" w:name="本文中的超节点"/>
@@ -967,7 +967,7 @@
               <w:jc w:val="left"/>
             </w:pPr>
             <w:r>
-              <w:t xml:space="preserve">回答的问题</w:t>
+              <w:t xml:space="preserve">规模含义</w:t>
             </w:r>
           </w:p>
         </w:tc>
@@ -993,7 +993,7 @@
               <w:jc w:val="left"/>
             </w:pPr>
             <w:r>
-              <w:t xml:space="preserve">一个模型副本需要多少 NPU 协同计算</w:t>
+              <w:t xml:space="preserve">一个模型副本协同计算所需的 NPU 数量</w:t>
             </w:r>
           </w:p>
         </w:tc>
@@ -1019,7 +1019,7 @@
               <w:jc w:val="left"/>
             </w:pPr>
             <w:r>
-              <w:t xml:space="preserve">多少高频通信 rank 应位于同一个高速互联域</w:t>
+              <w:t xml:space="preserve">同一高速互联域应容纳的高频通信 Rank 数量</w:t>
             </w:r>
           </w:p>
         </w:tc>
@@ -1045,7 +1045,7 @@
               <w:jc w:val="left"/>
             </w:pPr>
             <w:r>
-              <w:t xml:space="preserve">为达到总训练速度或总服务吞吐，需要多少 NPU</w:t>
+              <w:t xml:space="preserve">达到总训练速度或总服务吞吐所需的 NPU 总量</w:t>
             </w:r>
           </w:p>
         </w:tc>
@@ -1060,13 +1060,13 @@
       </w:r>
     </w:p>
     <w:bookmarkEnd w:id="23"/>
-    <w:bookmarkStart w:id="24" w:name="为什么不是越大越好"/>
+    <w:bookmarkStart w:id="24" w:name="超节点规模扩大的收益与边界"/>
     <w:p>
       <w:pPr>
         <w:pStyle w:val="Heading3"/>
       </w:pPr>
       <w:r>
-        <w:t xml:space="preserve">1.3 为什么不是越大越好</w:t>
+        <w:t xml:space="preserve">1.3 超节点规模扩大的收益与边界</w:t>
       </w:r>
     </w:p>
     <w:p>
@@ -1907,7 +1907,7 @@
         <w:t xml:space="preserve">总参数量</w:t>
       </w:r>
       <w:r>
-        <w:t xml:space="preserve">决定模型和训练状态能否装入；</w:t>
+        <w:t xml:space="preserve">决定模型和训练状态的装入规模；</w:t>
       </w:r>
     </w:p>
     <w:p>
@@ -2301,13 +2301,13 @@
       </w:r>
     </w:p>
     <w:bookmarkEnd w:id="28"/>
-    <w:bookmarkStart w:id="29" w:name="序列长度为什么关键"/>
+    <w:bookmarkStart w:id="29" w:name="序列长度对规模的影响"/>
     <w:p>
       <w:pPr>
         <w:pStyle w:val="Heading3"/>
       </w:pPr>
       <w:r>
-        <w:t xml:space="preserve">2.4 序列长度为什么关键</w:t>
+        <w:t xml:space="preserve">2.4 序列长度对规模的影响</w:t>
       </w:r>
     </w:p>
     <w:p>
@@ -3794,7 +3794,7 @@
         <w:pStyle w:val="FirstParagraph"/>
       </w:pPr>
       <w:r>
-        <w:t xml:space="preserve">这些层级可以扩大可服务容量，但不能无条件替代 HBM。是否适合放置 KV、Activation 或权重，取决于访问频率、带宽、时延和是否可与计算重叠。</w:t>
+        <w:t xml:space="preserve">这些层级可以扩大可服务容量，但不能无条件替代 HBM。各层级对KV、Activation或权重的适用性，取决于访问频率、带宽、时延和计算重叠能力。</w:t>
       </w:r>
     </w:p>
     <w:p>
@@ -3802,7 +3802,7 @@
         <w:pStyle w:val="BodyText"/>
       </w:pPr>
       <w:r>
-        <w:t xml:space="preserve">报告中应分别写：</w:t>
+        <w:t xml:space="preserve">报告中应分别评估：</w:t>
       </w:r>
     </w:p>
     <w:p>
@@ -3813,7 +3813,7 @@
         <w:rPr>
           <w:rStyle w:val="VerbatimChar"/>
         </w:rPr>
-        <w:t xml:space="preserve">容量够不够？</w:t>
+        <w:t xml:space="preserve">容量约束</w:t>
       </w:r>
       <w:r>
         <w:br/>
@@ -3822,7 +3822,7 @@
         <w:rPr>
           <w:rStyle w:val="VerbatimChar"/>
         </w:rPr>
-        <w:t xml:space="preserve">带宽够不够？</w:t>
+        <w:t xml:space="preserve">带宽约束</w:t>
       </w:r>
       <w:r>
         <w:br/>
@@ -3831,7 +3831,7 @@
         <w:rPr>
           <w:rStyle w:val="VerbatimChar"/>
         </w:rPr>
-        <w:t xml:space="preserve">时延是否进入关键路径？</w:t>
+        <w:t xml:space="preserve">关键路径时延</w:t>
       </w:r>
     </w:p>
     <w:p>
@@ -4315,7 +4315,7 @@
         <w:pStyle w:val="FirstParagraph"/>
       </w:pPr>
       <w:r>
-        <w:t xml:space="preserve">这只是“能装下、理论上能按时算完”，尚未考虑并行切分是否可行以及通信是否过重。</w:t>
+        <w:t xml:space="preserve">这只是模型装入和理论按时完成的下界，尚未验证并行切分可行性与通信开销。</w:t>
       </w:r>
     </w:p>
     <w:bookmarkEnd w:id="37"/>
@@ -5555,7 +5555,7 @@
         <w:rPr>
           <w:rStyle w:val="VerbatimChar"/>
         </w:rPr>
-        <w:t xml:space="preserve"> → 是否跨超节点</w:t>
+        <w:t xml:space="preserve"> → 跨超节点映射</w:t>
       </w:r>
       <w:r>
         <w:br/>
@@ -5787,13 +5787,13 @@
     </w:p>
     <w:bookmarkEnd w:id="44"/>
     <w:bookmarkEnd w:id="45"/>
-    <w:bookmarkStart w:id="53" w:name="dense-模型训练需要多大超节点"/>
+    <w:bookmarkStart w:id="53" w:name="dense-模型训练的超节点规模需求"/>
     <w:p>
       <w:pPr>
         <w:pStyle w:val="Heading2"/>
       </w:pPr>
       <w:r>
-        <w:t xml:space="preserve">6. Dense 模型训练需要多大超节点</w:t>
+        <w:t xml:space="preserve">6. Dense 模型训练的超节点规模需求</w:t>
       </w:r>
     </w:p>
     <w:p>
@@ -5812,7 +5812,7 @@
         <w:rPr>
           <w:rStyle w:val="VerbatimChar"/>
         </w:rPr>
-        <w:t xml:space="preserve">训练状态能否装下</w:t>
+        <w:t xml:space="preserve">训练状态容量评估</w:t>
       </w:r>
       <w:r>
         <w:br/>
@@ -5821,7 +5821,7 @@
         <w:rPr>
           <w:rStyle w:val="VerbatimChar"/>
         </w:rPr>
-        <w:t xml:space="preserve"> → Activation 能否装下</w:t>
+        <w:t xml:space="preserve"> → Activation容量评估</w:t>
       </w:r>
       <w:r>
         <w:br/>
@@ -5830,7 +5830,7 @@
         <w:rPr>
           <w:rStyle w:val="VerbatimChar"/>
         </w:rPr>
-        <w:t xml:space="preserve"> → TP/PP 如何切分</w:t>
+        <w:t xml:space="preserve"> → TP/PP切分方案</w:t>
       </w:r>
       <w:r>
         <w:br/>
@@ -5839,7 +5839,7 @@
         <w:rPr>
           <w:rStyle w:val="VerbatimChar"/>
         </w:rPr>
-        <w:t xml:space="preserve"> → TP 高频通信是否适合当前超节点</w:t>
+        <w:t xml:space="preserve"> → TP高频通信与超节点的匹配</w:t>
       </w:r>
     </w:p>
     <w:bookmarkStart w:id="46" w:name="训练状态内存"/>
@@ -6170,13 +6170,13 @@
       </w:r>
     </w:p>
     <w:bookmarkEnd w:id="46"/>
-    <w:bookmarkStart w:id="47" w:name="zero-如何改变单卡内存"/>
+    <w:bookmarkStart w:id="47" w:name="zero-对单卡内存的影响"/>
     <w:p>
       <w:pPr>
         <w:pStyle w:val="Heading3"/>
       </w:pPr>
       <w:r>
-        <w:t xml:space="preserve">6.2 ZeRO 如何改变单卡内存</w:t>
+        <w:t xml:space="preserve">6.2 ZeRO 对单卡内存的影响</w:t>
       </w:r>
     </w:p>
     <w:p>
@@ -7293,7 +7293,7 @@
         <w:pStyle w:val="FirstParagraph"/>
       </w:pPr>
       <w:r>
-        <w:t xml:space="preserve">式（16）适合估算模型矩阵乘主项，式（17）解释为什么序列很长时，单纯使用</w:t>
+        <w:t xml:space="preserve">式（16）适合估算模型矩阵乘主项，式（17）说明长序列场景下单纯使用</w:t>
       </w:r>
       <w:r>
         <w:t xml:space="preserve"> </w:t>
@@ -7371,13 +7371,13 @@
       </w:r>
     </w:p>
     <w:bookmarkEnd w:id="49"/>
-    <w:bookmarkStart w:id="50" w:name="tp-为什么优先留在超节点内"/>
+    <w:bookmarkStart w:id="50" w:name="tp-在超节点内的优先级"/>
     <w:p>
       <w:pPr>
         <w:pStyle w:val="Heading3"/>
       </w:pPr>
       <w:r>
-        <w:t xml:space="preserve">6.5 TP 为什么优先留在超节点内</w:t>
+        <w:t xml:space="preserve">6.5 TP 在超节点内的优先级</w:t>
       </w:r>
     </w:p>
     <w:p>
@@ -7786,13 +7786,13 @@
       </w:r>
     </w:p>
     <w:bookmarkEnd w:id="50"/>
-    <w:bookmarkStart w:id="51" w:name="pp-与-dp-为什么更容易跨超节点"/>
+    <w:bookmarkStart w:id="51" w:name="pp-与-dp-的跨超节点扩展特征"/>
     <w:p>
       <w:pPr>
         <w:pStyle w:val="Heading3"/>
       </w:pPr>
       <w:r>
-        <w:t xml:space="preserve">6.6 PP 与 DP 为什么更容易跨超节点</w:t>
+        <w:t xml:space="preserve">6.6 PP 与 DP 的跨超节点扩展特征</w:t>
       </w:r>
     </w:p>
     <w:p>
@@ -8106,7 +8106,7 @@
         <w:pStyle w:val="FirstParagraph"/>
       </w:pPr>
       <w:r>
-        <w:t xml:space="preserve">PP 是否完整位于超节点内，应由 Stage 通信、故障域和调度方式决定。</w:t>
+        <w:t xml:space="preserve">PP完整置于超节点内的必要性，应由Stage通信、故障域和调度方式决定。</w:t>
       </w:r>
     </w:p>
     <w:p>
@@ -8118,13 +8118,13 @@
     </w:p>
     <w:bookmarkEnd w:id="52"/>
     <w:bookmarkEnd w:id="53"/>
-    <w:bookmarkStart w:id="61" w:name="moe-训练专家数为什么会改变超节点规模"/>
+    <w:bookmarkStart w:id="61" w:name="moe-训练中的专家规模效应"/>
     <w:p>
       <w:pPr>
         <w:pStyle w:val="Heading2"/>
       </w:pPr>
       <w:r>
-        <w:t xml:space="preserve">7. MoE 训练：专家数为什么会改变超节点规模</w:t>
+        <w:t xml:space="preserve">7. MoE 训练中的专家规模效应</w:t>
       </w:r>
     </w:p>
     <w:p>
@@ -10632,7 +10632,7 @@
         <w:pStyle w:val="BlockText"/>
       </w:pPr>
       <w:r>
-        <w:t xml:space="preserve">为了让专家权重装下、单专家计算仍足够饱满、EP通信不跨越低速网络，至少需要多大的 TP×EP 高频域？</w:t>
+        <w:t xml:space="preserve">MoE推荐规模需要同时满足专家权重容量、单专家计算饱满度和EP通信本地化要求，由此确定TP×EP高频域。</w:t>
       </w:r>
     </w:p>
     <w:p>
@@ -11170,13 +11170,13 @@
       </m:oMathPara>
     </w:p>
     <w:bookmarkEnd w:id="62"/>
-    <w:bookmarkStart w:id="63" w:name="cp-如何切长序列"/>
+    <w:bookmarkStart w:id="63" w:name="cp-的长序列切分机制"/>
     <w:p>
       <w:pPr>
         <w:pStyle w:val="Heading3"/>
       </w:pPr>
       <w:r>
-        <w:t xml:space="preserve">8.2 CP 如何切长序列</w:t>
+        <w:t xml:space="preserve">8.2 CP 的长序列切分机制</w:t>
       </w:r>
     </w:p>
     <w:p>
@@ -11473,7 +11473,7 @@
         <w:pStyle w:val="FirstParagraph"/>
       </w:pPr>
       <w:r>
-        <w:t xml:space="preserve">但 CP 是否必须完全在超节点内，要比较：</w:t>
+        <w:t xml:space="preserve">CP完整置于超节点内的必要性取决于以下时间对比：</w:t>
       </w:r>
     </w:p>
     <w:p>
@@ -11750,13 +11750,13 @@
     </w:p>
     <w:bookmarkEnd w:id="65"/>
     <w:bookmarkEnd w:id="66"/>
-    <w:bookmarkStart w:id="80" w:name="推理负载同一个模型为什么会需要不同规模"/>
+    <w:bookmarkStart w:id="80" w:name="推理负载的规模差异"/>
     <w:p>
       <w:pPr>
         <w:pStyle w:val="Heading2"/>
       </w:pPr>
       <w:r>
-        <w:t xml:space="preserve">9. 推理负载：同一个模型为什么会需要不同规模</w:t>
+        <w:t xml:space="preserve">9. 推理负载的规模差异</w:t>
       </w:r>
     </w:p>
     <w:p>
@@ -11840,7 +11840,7 @@
         <w:rPr>
           <w:rStyle w:val="VerbatimChar"/>
         </w:rPr>
-        <w:t xml:space="preserve">模型和 KV 能不能装下？</w:t>
+        <w:t xml:space="preserve">模型与KV容量</w:t>
       </w:r>
       <w:r>
         <w:br/>
@@ -11849,7 +11849,7 @@
         <w:rPr>
           <w:rStyle w:val="VerbatimChar"/>
         </w:rPr>
-        <w:t xml:space="preserve">Prefill 是否满足 TTFT？</w:t>
+        <w:t xml:space="preserve">Prefill的TTFT约束</w:t>
       </w:r>
       <w:r>
         <w:br/>
@@ -11858,7 +11858,7 @@
         <w:rPr>
           <w:rStyle w:val="VerbatimChar"/>
         </w:rPr>
-        <w:t xml:space="preserve">Decode 是否满足 TPOT？</w:t>
+        <w:t xml:space="preserve">Decode的TPOT约束</w:t>
       </w:r>
       <w:r>
         <w:br/>
@@ -11867,7 +11867,7 @@
         <w:rPr>
           <w:rStyle w:val="VerbatimChar"/>
         </w:rPr>
-        <w:t xml:space="preserve">总副本数是否满足吞吐？</w:t>
+        <w:t xml:space="preserve">总副本数的吞吐约束</w:t>
       </w:r>
     </w:p>
     <w:bookmarkStart w:id="67" w:name="权重容量"/>
@@ -13673,7 +13673,7 @@
         <w:t xml:space="preserve"> </w:t>
       </w:r>
       <w:r>
-        <w:t xml:space="preserve">取决于是否按因果三角区域执行以及 FLOPs 口径。</w:t>
+        <w:t xml:space="preserve">取值受因果三角区域执行方式和FLOPs口径影响。</w:t>
       </w:r>
     </w:p>
     <w:p>
@@ -15119,7 +15119,7 @@
         <w:pStyle w:val="Compact"/>
       </w:pPr>
       <w:r>
-        <w:t xml:space="preserve">是否包含排队和网络；</w:t>
+        <w:t xml:space="preserve">排队和网络的统计范围；</w:t>
       </w:r>
     </w:p>
     <w:p>
@@ -15139,19 +15139,7 @@
         <w:pStyle w:val="FirstParagraph"/>
       </w:pPr>
       <w:r>
-        <w:t xml:space="preserve">没有这些口径，</w:t>
-      </w:r>
-      <w:r>
-        <w:t xml:space="preserve">“</w:t>
-      </w:r>
-      <w:r>
-        <w:t xml:space="preserve">每秒多少 Token</w:t>
-      </w:r>
-      <w:r>
-        <w:t xml:space="preserve">”</w:t>
-      </w:r>
-      <w:r>
-        <w:t xml:space="preserve">无法用于超节点选型。</w:t>
+        <w:t xml:space="preserve">缺少这些口径时，Token吞吐值无法用于超节点选型。</w:t>
       </w:r>
     </w:p>
     <w:bookmarkEnd w:id="77"/>
@@ -15241,7 +15229,7 @@
         <w:pStyle w:val="Compact"/>
       </w:pPr>
       <w:r>
-        <w:t xml:space="preserve">单专家 Micro Batch 是否足够大。</w:t>
+        <w:t xml:space="preserve">单专家Micro Batch的计算饱满度。</w:t>
       </w:r>
     </w:p>
     <w:p>
@@ -15637,7 +15625,7 @@
         <w:pStyle w:val="Compact"/>
       </w:pPr>
       <w:r>
-        <w:t xml:space="preserve">是否逐层流水传输；</w:t>
+        <w:t xml:space="preserve">逐层流水传输方式；</w:t>
       </w:r>
     </w:p>
     <w:p>
@@ -15681,13 +15669,13 @@
     </w:p>
     <w:bookmarkEnd w:id="79"/>
     <w:bookmarkEnd w:id="80"/>
-    <w:bookmarkStart w:id="86" w:name="通信如何确定超节点边界"/>
+    <w:bookmarkStart w:id="86" w:name="通信约束与超节点边界"/>
     <w:p>
       <w:pPr>
         <w:pStyle w:val="Heading2"/>
       </w:pPr>
       <w:r>
-        <w:t xml:space="preserve">10. 通信如何确定超节点边界</w:t>
+        <w:t xml:space="preserve">10. 通信约束与超节点边界</w:t>
       </w:r>
     </w:p>
     <w:bookmarkStart w:id="81" w:name="五类并行的通信特征"/>
@@ -16021,7 +16009,7 @@
         <w:pStyle w:val="BodyText"/>
       </w:pPr>
       <w:r>
-        <w:t xml:space="preserve">这张表解释了为什么超节点规模首先服务模型并行通信域，而不是简单服务整个任务。</w:t>
+        <w:t xml:space="preserve">这张表说明超节点规模首先服务模型并行通信域，而不是简单服务整个任务。</w:t>
       </w:r>
     </w:p>
     <w:bookmarkEnd w:id="81"/>
@@ -16692,7 +16680,7 @@
         <w:pStyle w:val="Compact"/>
       </w:pPr>
       <w:r>
-        <w:t xml:space="preserve">每 NPU 注入带宽是否足够；</w:t>
+        <w:t xml:space="preserve">单NPU注入带宽充足度；</w:t>
       </w:r>
     </w:p>
     <w:p>
@@ -16704,7 +16692,7 @@
         <w:pStyle w:val="Compact"/>
       </w:pPr>
       <w:r>
-        <w:t xml:space="preserve">任意两组之间是否无收敛；</w:t>
+        <w:t xml:space="preserve">任意两组之间的无收敛互联能力；</w:t>
       </w:r>
     </w:p>
     <w:p>
@@ -16716,7 +16704,7 @@
         <w:pStyle w:val="Compact"/>
       </w:pPr>
       <w:r>
-        <w:t xml:space="preserve">All-to-All 是否发生热点；</w:t>
+        <w:t xml:space="preserve">All-to-All热点；</w:t>
       </w:r>
     </w:p>
     <w:p>
@@ -16728,7 +16716,7 @@
         <w:pStyle w:val="Compact"/>
       </w:pPr>
       <w:r>
-        <w:t xml:space="preserve">跨层、跨柜跳数是多少；</w:t>
+        <w:t xml:space="preserve">跨层、跨柜跳数；</w:t>
       </w:r>
     </w:p>
     <w:p>
@@ -16740,7 +16728,7 @@
         <w:pStyle w:val="Compact"/>
       </w:pPr>
       <w:r>
-        <w:t xml:space="preserve">多个并行组同时运行时是否争用；</w:t>
+        <w:t xml:space="preserve">多个并行组同时运行时的带宽争用；</w:t>
       </w:r>
     </w:p>
     <w:p>
@@ -16752,7 +16740,7 @@
         <w:pStyle w:val="Compact"/>
       </w:pPr>
       <w:r>
-        <w:t xml:space="preserve">故障或降级路由后是否维持带宽。</w:t>
+        <w:t xml:space="preserve">故障或降级路由后的带宽保持能力。</w:t>
       </w:r>
     </w:p>
     <w:p>
@@ -18368,7 +18356,7 @@
         <w:t xml:space="preserve"> </w:t>
       </w:r>
       <w:r>
-        <w:t xml:space="preserve">同时考虑是否满足SLO和相对基准规模</w:t>
+        <w:t xml:space="preserve">同时纳入SLO达成状态和相对基准规模</w:t>
       </w:r>
       <w:r>
         <w:t xml:space="preserve"> </w:t>
@@ -18400,7 +18388,7 @@
         <w:t xml:space="preserve"> </w:t>
       </w:r>
       <w:r>
-        <w:t xml:space="preserve">的扩展效率。例如，不满足SLO时取0，满足SLO时可取</w:t>
+        <w:t xml:space="preserve">的扩展效率。例如，未达到SLO时取0，达到SLO时可取</w:t>
       </w:r>
       <w:r>
         <w:t xml:space="preserve"> </w:t>
@@ -19643,7 +19631,7 @@
         <w:pStyle w:val="FirstParagraph"/>
       </w:pPr>
       <w:r>
-        <w:t xml:space="preserve">本章的目的不是用一组算例替代真实 Benchmark，而是演示如何把前述方法落到具体数字。</w:t>
+        <w:t xml:space="preserve">本章不以一组算例替代真实Benchmark，而是展示前述方法的数值化应用。</w:t>
       </w:r>
     </w:p>
     <w:bookmarkStart w:id="101" w:name="必须区分的两套公开口径"/>
@@ -23365,7 +23353,7 @@
         <w:pStyle w:val="FirstParagraph"/>
       </w:pPr>
       <w:r>
-        <w:t xml:space="preserve">合计约103.4 GB，距122.4 GB规划容量约有19 GB用于Workspace、分页碎片和临时Activation。是否真正可行还需检查框架是否支持该TP×CP布局及运行时峰值。</w:t>
+        <w:t xml:space="preserve">合计约103.4 GB，距122.4 GB规划容量约有19 GB用于Workspace、分页碎片和临时Activation。实际可行性还需结合框架对该TP×CP布局的支持情况和运行时峰值验证。</w:t>
       </w:r>
     </w:p>
     <w:bookmarkEnd w:id="109"/>
@@ -23905,7 +23893,7 @@
         <w:pStyle w:val="Compact"/>
       </w:pPr>
       <w:r>
-        <w:t xml:space="preserve">逐层传输能否与Prefill重叠；</w:t>
+        <w:t xml:space="preserve">逐层传输与Prefill的重叠能力；</w:t>
       </w:r>
     </w:p>
     <w:p>
@@ -23917,7 +23905,7 @@
         <w:pStyle w:val="Compact"/>
       </w:pPr>
       <w:r>
-        <w:t xml:space="preserve">Fabric路径和其他通信是否争用。</w:t>
+        <w:t xml:space="preserve">Fabric路径与其他通信的带宽争用。</w:t>
       </w:r>
     </w:p>
     <w:bookmarkStart w:id="113" w:name="结论-3"/>
@@ -23987,7 +23975,7 @@
         <w:br/>
       </w:r>
       <w:r>
-        <w:t xml:space="preserve">对很多Dense推理和训练负载，高效并行组远小于1024。能否稳定划分为多个64/128卡高速域，决定多负载覆盖能力。</w:t>
+        <w:t xml:space="preserve">对很多Dense推理和训练负载，高效并行组远小于1024。稳定划分为多个64/128卡高速域的能力决定多负载覆盖范围。</w:t>
       </w:r>
     </w:p>
     <w:p>
@@ -24054,13 +24042,13 @@
       </w:r>
     </w:p>
     <w:bookmarkEnd w:id="115"/>
-    <w:bookmarkStart w:id="119" w:name="算例能证明什么不能证明什么"/>
+    <w:bookmarkStart w:id="119" w:name="算例的适用范围与结论边界"/>
     <w:p>
       <w:pPr>
         <w:pStyle w:val="Heading3"/>
       </w:pPr>
       <w:r>
-        <w:t xml:space="preserve">12.8 算例能证明什么、不能证明什么</w:t>
+        <w:t xml:space="preserve">12.8 算例的适用范围与结论边界</w:t>
       </w:r>
     </w:p>
     <w:tbl>
@@ -25177,7 +25165,7 @@
         <w:br/>
       </w:r>
       <w:r>
-        <w:t xml:space="preserve">TP、EP、CP产生逐层或逐MoE层通信，决定哪些Rank值得位于同一Scale-up域。</w:t>
+        <w:t xml:space="preserve">TP、EP、CP产生逐层或逐MoE层通信，决定应置于同一Scale-up域的Rank范围。</w:t>
       </w:r>
     </w:p>
     <w:p>
@@ -27336,13 +27324,13 @@
       </w:r>
     </w:p>
     <w:bookmarkEnd w:id="129"/>
-    <w:bookmarkStart w:id="130" w:name="附录-b结果应如何表达"/>
+    <w:bookmarkStart w:id="130" w:name="附录-b结果表达模板"/>
     <w:p>
       <w:pPr>
         <w:pStyle w:val="Heading2"/>
       </w:pPr>
       <w:r>
-        <w:t xml:space="preserve">附录 B：结果应如何表达</w:t>
+        <w:t xml:space="preserve">附录 B：结果表达模板</w:t>
       </w:r>
     </w:p>
     <w:p>

</xml_diff>

<commit_message>
docs: fix merged documentation entry points
Co-authored-by: Tao Gao <taogao1991@outlook.com>
</commit_message>
<xml_diff>
--- a/docs/supernode-scale/昇腾超节点规模需求分析.docx
+++ b/docs/supernode-scale/昇腾超节点规模需求分析.docx
@@ -55,7 +55,7 @@
         <w:t xml:space="preserve">昇腾超节点产品规格定义与客户训练/推理负载选型</w:t>
       </w:r>
       <w:r>
-        <w:br/>
+        <w:t xml:space="preserve"> </w:t>
       </w:r>
       <w:r>
         <w:rPr>
@@ -71,7 +71,7 @@
         <w:t xml:space="preserve">v0.1</w:t>
       </w:r>
       <w:r>
-        <w:br/>
+        <w:t xml:space="preserve"> </w:t>
       </w:r>
       <w:r>
         <w:rPr>
@@ -87,7 +87,7 @@
         <w:t xml:space="preserve">2026-08-11</w:t>
       </w:r>
       <w:r>
-        <w:br/>
+        <w:t xml:space="preserve"> </w:t>
       </w:r>
       <w:r>
         <w:rPr>
@@ -11566,7 +11566,7 @@
         <w:t xml:space="preserve">只看 Activation 容量，不看 Attention FLOPs。</w:t>
       </w:r>
       <w:r>
-        <w:br/>
+        <w:t xml:space="preserve"> </w:t>
       </w:r>
       <w:r>
         <w:t xml:space="preserve">FlashAttention 解决存储和 IO，不会消除所有 Token 两两交互。</w:t>
@@ -11633,7 +11633,7 @@
         <w:t xml:space="preserve">。</w:t>
       </w:r>
       <w:r>
-        <w:br/>
+        <w:t xml:space="preserve"> </w:t>
       </w:r>
       <w:r>
         <w:t xml:space="preserve">总工作量仍是</w:t>
@@ -11735,7 +11735,7 @@
         <w:t xml:space="preserve">认为序列越长，超节点必须按同样比例扩大。</w:t>
       </w:r>
       <w:r>
-        <w:br/>
+        <w:t xml:space="preserve"> </w:t>
       </w:r>
       <w:r>
         <w:t xml:space="preserve">重计算、FlashAttention、PP和Micro Batch调整也能降低单 Rank 容量；超节点规模最终由 TP×CP 的性能拐点决定。</w:t>
@@ -23951,7 +23951,7 @@
         <w:t xml:space="preserve">64卡扩展粒度适合成为分析基本单元。</w:t>
       </w:r>
       <w:r>
-        <w:br/>
+        <w:t xml:space="preserve"> </w:t>
       </w:r>
       <w:r>
         <w:t xml:space="preserve">路线图披露以64卡为步长扩展，产品评估应重点测64卡子域及其倍数，而不是只测最大规模。</w:t>
@@ -23972,7 +23972,7 @@
         <w:t xml:space="preserve">1024卡真机应重点验证子域能力。</w:t>
       </w:r>
       <w:r>
-        <w:br/>
+        <w:t xml:space="preserve"> </w:t>
       </w:r>
       <w:r>
         <w:t xml:space="preserve">对很多Dense推理和训练负载，高效并行组远小于1024。稳定划分为多个64/128卡高速域的能力决定多负载覆盖范围。</w:t>
@@ -24014,7 +24014,7 @@
         <w:t xml:space="preserve">统一编址容量不能替代性能分层。</w:t>
       </w:r>
       <w:r>
-        <w:br/>
+        <w:t xml:space="preserve"> </w:t>
       </w:r>
       <w:r>
         <w:t xml:space="preserve">应分别公布和实测HBM、本地DDR、远端/池化内存的容量、带宽、时延和并发访问表现。</w:t>
@@ -24035,7 +24035,7 @@
         <w:t xml:space="preserve">路线图峰值不等于客户性能。</w:t>
       </w:r>
       <w:r>
-        <w:br/>
+        <w:t xml:space="preserve"> </w:t>
       </w:r>
       <w:r>
         <w:t xml:space="preserve">客户选型最终需要模型级MFU、HCCL有效带宽、TTFT、TPOT和All-to-All尾延迟。</w:t>
@@ -25099,7 +25099,7 @@
         <w:t xml:space="preserve">模型总参数量</w:t>
       </w:r>
       <w:r>
-        <w:br/>
+        <w:t xml:space="preserve"> </w:t>
       </w:r>
       <w:r>
         <w:t xml:space="preserve">决定权重和训练状态容量，MoE尤其明显。</w:t>
@@ -25120,7 +25120,7 @@
         <w:t xml:space="preserve">每 Token 激活参数量</w:t>
       </w:r>
       <w:r>
-        <w:br/>
+        <w:t xml:space="preserve"> </w:t>
       </w:r>
       <w:r>
         <w:t xml:space="preserve">决定主要计算量；MoE不能用总参数量直接估算每Token FLOPs。</w:t>
@@ -25141,7 +25141,7 @@
         <w:t xml:space="preserve">序列长度与并发</w:t>
       </w:r>
       <w:r>
-        <w:br/>
+        <w:t xml:space="preserve"> </w:t>
       </w:r>
       <w:r>
         <w:t xml:space="preserve">训练侧影响Attention和Activation，推理侧影响KV Cache和KV读取。</w:t>
@@ -25162,7 +25162,7 @@
         <w:t xml:space="preserve">高频并行域</w:t>
       </w:r>
       <w:r>
-        <w:br/>
+        <w:t xml:space="preserve"> </w:t>
       </w:r>
       <w:r>
         <w:t xml:space="preserve">TP、EP、CP产生逐层或逐MoE层通信，决定应置于同一Scale-up域的Rank范围。</w:t>
@@ -25183,7 +25183,7 @@
         <w:t xml:space="preserve">性能目标</w:t>
       </w:r>
       <w:r>
-        <w:br/>
+        <w:t xml:space="preserve"> </w:t>
       </w:r>
       <w:r>
         <w:t xml:space="preserve">没有训练Token/s、TTFT、TPOT、吞吐或扩展效率目标，只能求容量下界，不能求唯一推荐规模。</w:t>

</xml_diff>